<commit_message>
Response: describe source archive commit precisely
Co-Authored-By: Claude Opus 5.5 <noreply@anthropic.com>
Claude-Session: https://claude.ai/code/session_01GFzJmQTFtMep2it1kYJtwA
</commit_message>
<xml_diff>
--- a/cassia/manuscript/CASSIA_response_to_reviewer.docx
+++ b/cassia/manuscript/CASSIA_response_to_reviewer.docx
@@ -3219,7 +3219,7 @@
         <w:t xml:space="preserve">Verifiability.</w:t>
       </w:r>
       <w:r>
-        <w:t xml:space="preserve"> A source archive of commit </w:t>
+        <w:t xml:space="preserve"> A source archive of the submission commit, which descends from code commit </w:t>
       </w:r>
       <w:r>
         <w:rPr>
@@ -3230,7 +3230,7 @@
         <w:t xml:space="preserve">72a0b17</w:t>
       </w:r>
       <w:r>
-        <w:t xml:space="preserve"> (</w:t>
+        <w:t xml:space="preserve"> and adds only the manuscript documents and release logs, (</w:t>
       </w:r>
       <w:r>
         <w:rPr>

</xml_diff>